<commit_message>
docs: add redesign previews
</commit_message>
<xml_diff>
--- a/docs/网站改版说明.docx
+++ b/docs/网站改版说明.docx
@@ -223,6 +223,108 @@
       </w:pPr>
       <w:r>
         <w:t>替换封面图和头像，再运行 build-site.cmd 并 push。</w:t>
+      </w:r>
+    </w:p>
+    <w:p>
+      <w:pPr>
+        <w:pStyle w:val="Heading1"/>
+      </w:pPr>
+      <w:r>
+        <w:t>六、设计预览</w:t>
+      </w:r>
+    </w:p>
+    <w:p>
+      <w:pPr>
+        <w:jc w:val="center"/>
+      </w:pPr>
+      <w:r>
+        <w:drawing>
+          <wp:inline xmlns:a="http://schemas.openxmlformats.org/drawingml/2006/main" xmlns:pic="http://schemas.openxmlformats.org/drawingml/2006/picture">
+            <wp:extent cx="5669280" cy="25103608"/>
+            <wp:docPr id="1" name="Picture 1"/>
+            <wp:cNvGraphicFramePr>
+              <a:graphicFrameLocks noChangeAspect="1"/>
+            </wp:cNvGraphicFramePr>
+            <a:graphic>
+              <a:graphicData uri="http://schemas.openxmlformats.org/drawingml/2006/picture">
+                <pic:pic>
+                  <pic:nvPicPr>
+                    <pic:cNvPr id="0" name="preview-home-v2.png"/>
+                    <pic:cNvPicPr/>
+                  </pic:nvPicPr>
+                  <pic:blipFill>
+                    <a:blip r:embed="rId9"/>
+                    <a:stretch>
+                      <a:fillRect/>
+                    </a:stretch>
+                  </pic:blipFill>
+                  <pic:spPr>
+                    <a:xfrm>
+                      <a:off x="0" y="0"/>
+                      <a:ext cx="5669280" cy="25103608"/>
+                    </a:xfrm>
+                    <a:prstGeom prst="rect"/>
+                  </pic:spPr>
+                </pic:pic>
+              </a:graphicData>
+            </a:graphic>
+          </wp:inline>
+        </w:drawing>
+      </w:r>
+    </w:p>
+    <w:p>
+      <w:pPr>
+        <w:jc w:val="center"/>
+      </w:pPr>
+      <w:r>
+        <w:t>新版首页：杂志式封面、粒子动画与内容分区</w:t>
+      </w:r>
+    </w:p>
+    <w:p>
+      <w:pPr>
+        <w:jc w:val="center"/>
+      </w:pPr>
+      <w:r>
+        <w:drawing>
+          <wp:inline xmlns:a="http://schemas.openxmlformats.org/drawingml/2006/main" xmlns:pic="http://schemas.openxmlformats.org/drawingml/2006/picture">
+            <wp:extent cx="5669280" cy="10993200"/>
+            <wp:docPr id="2" name="Picture 2"/>
+            <wp:cNvGraphicFramePr>
+              <a:graphicFrameLocks noChangeAspect="1"/>
+            </wp:cNvGraphicFramePr>
+            <a:graphic>
+              <a:graphicData uri="http://schemas.openxmlformats.org/drawingml/2006/picture">
+                <pic:pic>
+                  <pic:nvPicPr>
+                    <pic:cNvPr id="0" name="preview-dashboard-v2.png"/>
+                    <pic:cNvPicPr/>
+                  </pic:nvPicPr>
+                  <pic:blipFill>
+                    <a:blip r:embed="rId10"/>
+                    <a:stretch>
+                      <a:fillRect/>
+                    </a:stretch>
+                  </pic:blipFill>
+                  <pic:spPr>
+                    <a:xfrm>
+                      <a:off x="0" y="0"/>
+                      <a:ext cx="5669280" cy="10993200"/>
+                    </a:xfrm>
+                    <a:prstGeom prst="rect"/>
+                  </pic:spPr>
+                </pic:pic>
+              </a:graphicData>
+            </a:graphic>
+          </wp:inline>
+        </w:drawing>
+      </w:r>
+    </w:p>
+    <w:p>
+      <w:pPr>
+        <w:jc w:val="center"/>
+      </w:pPr>
+      <w:r>
+        <w:t>数据图表页：趋势、能力分布与时间分配</w:t>
       </w:r>
     </w:p>
     <w:sectPr>

</xml_diff>